<commit_message>
Remove temporary lock file and update document
</commit_message>
<xml_diff>
--- a/DatabaseScripts/EmployeeManagementDocumenttCase.docx
+++ b/DatabaseScripts/EmployeeManagementDocumenttCase.docx
@@ -750,16 +750,7 @@
           <w:sz w:val="20"/>
           <w:szCs w:val="20"/>
         </w:rPr>
-        <w:t>Log</w:t>
-      </w:r>
-      <w:bookmarkStart w:id="0" w:name="_GoBack"/>
-      <w:bookmarkEnd w:id="0"/>
-      <w:r>
-        <w:rPr>
-          <w:sz w:val="20"/>
-          <w:szCs w:val="20"/>
-        </w:rPr>
-        <w:t>File</w:t>
+        <w:t>LogFile</w:t>
       </w:r>
       <w:proofErr w:type="spellEnd"/>
       <w:r>
@@ -3234,15 +3225,35 @@
           <w:sz w:val="20"/>
           <w:szCs w:val="20"/>
         </w:rPr>
-        <w:t>Project  Salaries</w:t>
+        <w:t xml:space="preserve">Project  </w:t>
+      </w:r>
+      <w:r>
+        <w:rPr>
+          <w:rFonts w:ascii="Calibri" w:eastAsia="Times New Roman" w:hAnsi="Calibri" w:cs="Calibri"/>
+          <w:color w:val="000000"/>
+          <w:sz w:val="18"/>
+          <w:szCs w:val="18"/>
+        </w:rPr>
+        <w:t>Pensions</w:t>
       </w:r>
       <w:proofErr w:type="gramEnd"/>
       <w:r>
         <w:rPr>
-          <w:sz w:val="20"/>
-          <w:szCs w:val="20"/>
-        </w:rPr>
-        <w:t xml:space="preserve"> System.  </w:t>
+          <w:rFonts w:ascii="Calibri" w:eastAsia="Times New Roman" w:hAnsi="Calibri" w:cs="Calibri"/>
+          <w:color w:val="000000"/>
+          <w:sz w:val="18"/>
+          <w:szCs w:val="18"/>
+        </w:rPr>
+        <w:t xml:space="preserve"> System</w:t>
+      </w:r>
+      <w:bookmarkStart w:id="0" w:name="_GoBack"/>
+      <w:bookmarkEnd w:id="0"/>
+      <w:r>
+        <w:rPr>
+          <w:sz w:val="20"/>
+          <w:szCs w:val="20"/>
+        </w:rPr>
+        <w:t xml:space="preserve">.  </w:t>
       </w:r>
     </w:p>
     <w:p>

</xml_diff>

<commit_message>
Update DDL and DML scripts with complete view and fixes
</commit_message>
<xml_diff>
--- a/DatabaseScripts/EmployeeManagementDocumenttCase.docx
+++ b/DatabaseScripts/EmployeeManagementDocumenttCase.docx
@@ -3246,8 +3246,6 @@
         </w:rPr>
         <w:t xml:space="preserve"> System</w:t>
       </w:r>
-      <w:bookmarkStart w:id="0" w:name="_GoBack"/>
-      <w:bookmarkEnd w:id="0"/>
       <w:r>
         <w:rPr>
           <w:sz w:val="20"/>
@@ -4079,31 +4077,10 @@
         <w:spacing w:after="0"/>
       </w:pPr>
       <w:r>
-        <w:t>36.</w:t>
+        <w:t>36</w:t>
       </w:r>
       <w:r>
-        <w:t xml:space="preserve"> Create a View to show all </w:t>
-      </w:r>
-      <w:proofErr w:type="spellStart"/>
-      <w:r>
-        <w:t>employee</w:t>
-      </w:r>
-      <w:proofErr w:type="gramStart"/>
-      <w:r>
-        <w:t>,department</w:t>
-      </w:r>
-      <w:proofErr w:type="spellEnd"/>
-      <w:proofErr w:type="gramEnd"/>
-      <w:r>
-        <w:t>, and project details.</w:t>
-      </w:r>
-    </w:p>
-    <w:p>
-      <w:pPr>
-        <w:spacing w:after="0"/>
-      </w:pPr>
-      <w:r>
-        <w:t>37.</w:t>
+        <w:t>.</w:t>
       </w:r>
       <w:r>
         <w:t xml:space="preserve"> Give an example of EXISTS operator</w:t>
@@ -4118,8 +4095,10 @@
         </w:rPr>
       </w:pPr>
       <w:r>
-        <w:t>38</w:t>
+        <w:t>37</w:t>
       </w:r>
+      <w:bookmarkStart w:id="0" w:name="_GoBack"/>
+      <w:bookmarkEnd w:id="0"/>
       <w:r>
         <w:rPr>
           <w:sz w:val="20"/>

</xml_diff>